<commit_message>
Add ringless voicemail script to outreach templates
</commit_message>
<xml_diff>
--- a/downloads/Jag_Cold_Outreach_Templates.docx
+++ b/downloads/Jag_Cold_Outreach_Templates.docx
@@ -27,6 +27,99 @@
           <w:i w:val="0"/>
         </w:rPr>
         <w:t>The whole edge: you're not asking “want a website?” — you're showing one already built with their name on it. Lead with the link every time.</w:t>
+      </w:r>
+    </w:p>
+    <w:p>
+      <w:r>
+        <w:rPr>
+          <w:b/>
+          <w:color w:val="E55525"/>
+          <w:sz w:val="28"/>
+        </w:rPr>
+        <w:t>RINGLESS VOICEMAIL — 20-sec script (primary channel)</w:t>
+      </w:r>
+    </w:p>
+    <w:p>
+      <w:r>
+        <w:rPr>
+          <w:i/>
+          <w:color w:val="55555A"/>
+        </w:rPr>
+        <w:t>Drops straight to voicemail (no ring). Hits landlines AND mobiles. Record in your own voice, one casual take, smile while you talk. Say the phone number slowly — twice.</w:t>
+      </w:r>
+    </w:p>
+    <w:p>
+      <w:pPr>
+        <w:spacing w:after="0"/>
+        <w:ind w:left="288"/>
+      </w:pPr>
+      <w:r>
+        <w:rPr>
+          <w:rFonts w:ascii="Consolas" w:hAnsi="Consolas"/>
+          <w:sz w:val="21"/>
+        </w:rPr>
+        <w:t>Hi, my name's Jag - I build websites for local BC businesses. I noticed you</w:t>
+      </w:r>
+    </w:p>
+    <w:p>
+      <w:pPr>
+        <w:spacing w:after="0"/>
+        <w:ind w:left="288"/>
+      </w:pPr>
+      <w:r>
+        <w:rPr>
+          <w:rFonts w:ascii="Consolas" w:hAnsi="Consolas"/>
+          <w:sz w:val="21"/>
+        </w:rPr>
+        <w:t>don't have a website up yet, so I went ahead and built you a free demo to</w:t>
+      </w:r>
+    </w:p>
+    <w:p>
+      <w:pPr>
+        <w:spacing w:after="0"/>
+        <w:ind w:left="288"/>
+      </w:pPr>
+      <w:r>
+        <w:rPr>
+          <w:rFonts w:ascii="Consolas" w:hAnsi="Consolas"/>
+          <w:sz w:val="21"/>
+        </w:rPr>
+        <w:t>check out. Give me a quick call or text back at 778-977-2978 and I'll send</w:t>
+      </w:r>
+    </w:p>
+    <w:p>
+      <w:pPr>
+        <w:spacing w:after="0"/>
+        <w:ind w:left="288"/>
+      </w:pPr>
+      <w:r>
+        <w:rPr>
+          <w:rFonts w:ascii="Consolas" w:hAnsi="Consolas"/>
+          <w:sz w:val="21"/>
+        </w:rPr>
+        <w:t>you the link - it's already got your business name and info on it. Again,</w:t>
+      </w:r>
+    </w:p>
+    <w:p>
+      <w:pPr>
+        <w:spacing w:after="0"/>
+        <w:ind w:left="288"/>
+      </w:pPr>
+      <w:r>
+        <w:rPr>
+          <w:rFonts w:ascii="Consolas" w:hAnsi="Consolas"/>
+          <w:sz w:val="21"/>
+        </w:rPr>
+        <w:t>that's 778-977-2978, and you can see my work at jagmangat.com. Talk soon!</w:t>
+      </w:r>
+    </w:p>
+    <w:p>
+      <w:r>
+        <w:rPr>
+          <w:i/>
+          <w:color w:val="55555A"/>
+        </w:rPr>
+        <w:t>Note: confirm jagmangat.com loads your site before recording (it's the domain you forwarded). Pair the voicemail with a follow-up text an hour later for the contacts on mobile.</w:t>
       </w:r>
     </w:p>
     <w:p>

</xml_diff>